<commit_message>
docs: update introduction and distinguish pending acceptance
</commit_message>
<xml_diff>
--- a/documents/系統簡介.docx
+++ b/documents/系統簡介.docx
@@ -362,7 +362,7 @@
         <w:rPr>
           <w:rFonts w:ascii="標楷體" w:eastAsia="標楷體" w:hAnsi="標楷體"/>
         </w:rPr>
-        <w:t xml:space="preserve">是一套植物病害診斷系統，結合 </w:t>
+        <w:t xml:space="preserve">結合 </w:t>
       </w:r>
       <w:r>
         <w:rPr>
@@ -374,7 +374,7 @@
         <w:rPr>
           <w:rFonts w:ascii="標楷體" w:eastAsia="標楷體" w:hAnsi="標楷體"/>
         </w:rPr>
-        <w:t xml:space="preserve"> 行動應用、</w:t>
+        <w:t>、</w:t>
       </w:r>
       <w:proofErr w:type="spellStart"/>
       <w:r>
@@ -388,7 +388,7 @@
         <w:rPr>
           <w:rFonts w:ascii="標楷體" w:eastAsia="標楷體" w:hAnsi="標楷體"/>
         </w:rPr>
-        <w:t xml:space="preserve"> 後端、</w:t>
+        <w:t>、</w:t>
       </w:r>
       <w:r>
         <w:rPr>
@@ -400,31 +400,31 @@
         <w:rPr>
           <w:rFonts w:ascii="標楷體" w:eastAsia="標楷體" w:hAnsi="標楷體"/>
         </w:rPr>
-        <w:t xml:space="preserve"> 資料庫與 </w:t>
-      </w:r>
-      <w:r>
-        <w:rPr>
-          <w:rFonts w:eastAsia="標楷體"/>
-        </w:rPr>
-        <w:t xml:space="preserve">Google Gemini </w:t>
-      </w:r>
-      <w:r>
-        <w:rPr>
-          <w:rFonts w:ascii="標楷體" w:eastAsia="標楷體" w:hAnsi="標楷體"/>
-        </w:rPr>
-        <w:t>多模態</w:t>
-      </w:r>
-      <w:r>
-        <w:rPr>
-          <w:rFonts w:eastAsia="標楷體"/>
-        </w:rPr>
-        <w:t>AI</w:t>
-      </w:r>
-      <w:r>
-        <w:rPr>
-          <w:rFonts w:ascii="標楷體" w:eastAsia="標楷體" w:hAnsi="標楷體"/>
-        </w:rPr>
-        <w:t>。使用者可上傳植物照片，系統會分析作物與健康狀態，提供照護建議並保存個人診斷紀錄。</w:t>
+        <w:t xml:space="preserve"> 與 </w:t>
+      </w:r>
+      <w:r>
+        <w:rPr>
+          <w:rFonts w:eastAsia="標楷體"/>
+        </w:rPr>
+        <w:t>Google Gemini，協助使用者拍照或選圖，取得植物狀</w:t>
+      </w:r>
+      <w:r>
+        <w:rPr>
+          <w:rFonts w:ascii="標楷體" w:eastAsia="標楷體" w:hAnsi="標楷體"/>
+        </w:rPr>
+        <w:t>態</w:t>
+      </w:r>
+      <w:r>
+        <w:rPr>
+          <w:rFonts w:eastAsia="標楷體"/>
+        </w:rPr>
+        <w:t>初步判讀與照護參考資訊</w:t>
+      </w:r>
+      <w:r>
+        <w:rPr>
+          <w:rFonts w:ascii="標楷體" w:eastAsia="標楷體" w:hAnsi="標楷體"/>
+        </w:rPr>
+        <w:t>。使用者確認後才建立正式診斷紀錄；圖片與資料庫紀錄分開保存。</w:t>
       </w:r>
     </w:p>
     <w:p>
@@ -479,19 +479,17 @@
         <w:rPr>
           <w:rFonts w:ascii="標楷體" w:eastAsia="標楷體" w:hAnsi="標楷體"/>
         </w:rPr>
-        <w:t>系統提供帳號註冊與登入、信箱驗證、照片上傳診斷、診斷結果顯示、歷史紀錄查詢、管理者紀錄後台與忘記密碼後端流程。核心診斷流程會將圖片送至後端，由</w:t>
-      </w:r>
-      <w:r>
-        <w:rPr>
-          <w:rFonts w:eastAsia="標楷體"/>
-        </w:rPr>
-        <w:t>AI</w:t>
-      </w:r>
-      <w:r>
-        <w:rPr>
-          <w:rFonts w:ascii="標楷體" w:eastAsia="標楷體" w:hAnsi="標楷體"/>
-        </w:rPr>
-        <w:t>回傳作物名稱、健康狀態、信心值、建議與處理方法。</w:t>
+        <w:t>系統已實作註冊、信箱驗證、登入、登出、密碼重設、診斷確認、歷史紀錄、Webcam 監控與管理後台。Android 結果與歷史畫面已呈現來源、信心及需複核狀態，並將原始結果與使用者修正分列。警報查詢、確認與刪除目前由瀏覽器提供；Android 僅有對應 API 介面宣告，未提供警報管理畫面。已有程式實作不等同已通過建置或實機驗證。</w:t>
+      </w:r>
+      <w:r>
+        <w:rPr>
+          <w:rFonts w:eastAsia="標楷體"/>
+        </w:rPr>
+      </w:r>
+      <w:r>
+        <w:rPr>
+          <w:rFonts w:ascii="標楷體" w:eastAsia="標楷體" w:hAnsi="標楷體"/>
+        </w:rPr>
       </w:r>
     </w:p>
     <w:p>
@@ -615,45 +613,42 @@
         <w:rPr>
           <w:rFonts w:ascii="標楷體" w:eastAsia="標楷體" w:hAnsi="標楷體"/>
         </w:rPr>
-        <w:t>本系統特色包含拍照診斷、個人化歷史紀錄、</w:t>
-      </w:r>
-      <w:r>
-        <w:rPr>
-          <w:rFonts w:eastAsia="標楷體"/>
-        </w:rPr>
-        <w:t>Gemini AI</w:t>
-      </w:r>
-      <w:r>
-        <w:rPr>
-          <w:rFonts w:ascii="標楷體" w:eastAsia="標楷體" w:hAnsi="標楷體"/>
-        </w:rPr>
-        <w:t>多模態判斷、病蟲害知識補齊、</w:t>
-      </w:r>
-      <w:r>
-        <w:rPr>
-          <w:rFonts w:eastAsia="標楷體"/>
-        </w:rPr>
-        <w:t>Docker</w:t>
-      </w:r>
-      <w:r>
-        <w:rPr>
-          <w:rFonts w:ascii="標楷體" w:eastAsia="標楷體" w:hAnsi="標楷體"/>
-        </w:rPr>
-        <w:t>部署支援與後端</w:t>
+        <w:t>系統整合影像候選判讀、知識資料庫比對、個人歷史紀錄與 W</w:t>
+      </w:r>
+      <w:r>
+        <w:rPr>
+          <w:rFonts w:eastAsia="標楷體"/>
+        </w:rPr>
+        <w:t>ebcam 監控。來源欄位及需人工確認標記不代表已由專業人員複核；</w:t>
+      </w:r>
+      <w:r>
+        <w:rPr>
+          <w:rFonts w:ascii="標楷體" w:eastAsia="標楷體" w:hAnsi="標楷體"/>
+        </w:rPr>
+        <w:t>模型信心值也不等同辨識準確率</w:t>
+      </w:r>
+      <w:r>
+        <w:rPr>
+          <w:rFonts w:eastAsia="標楷體"/>
+        </w:rPr>
+      </w:r>
+      <w:r>
+        <w:rPr>
+          <w:rFonts w:ascii="標楷體" w:eastAsia="標楷體" w:hAnsi="標楷體"/>
+        </w:rPr>
       </w:r>
       <w:proofErr w:type="spellStart"/>
       <w:r>
         <w:rPr>
           <w:rFonts w:eastAsia="標楷體"/>
         </w:rPr>
-        <w:t>OpenAPI</w:t>
       </w:r>
       <w:proofErr w:type="spellEnd"/>
       <w:r>
         <w:rPr>
           <w:rFonts w:ascii="標楷體" w:eastAsia="標楷體" w:hAnsi="標楷體"/>
         </w:rPr>
-        <w:t>文件。</w:t>
+        <w:t>。</w:t>
       </w:r>
     </w:p>
     <w:p>
@@ -1023,13 +1018,13 @@
         <w:rPr>
           <w:rFonts w:eastAsia="標楷體"/>
         </w:rPr>
-        <w:t>SMTP</w:t>
-      </w:r>
-      <w:r>
-        <w:rPr>
-          <w:rFonts w:ascii="標楷體" w:eastAsia="標楷體" w:hAnsi="標楷體"/>
-        </w:rPr>
-        <w:t>設定。</w:t>
+        <w:t>的 SMTP</w:t>
+      </w:r>
+      <w:r>
+        <w:rPr>
+          <w:rFonts w:ascii="標楷體" w:eastAsia="標楷體" w:hAnsi="標楷體"/>
+        </w:rPr>
+        <w:t xml:space="preserve"> 設定。</w:t>
       </w:r>
     </w:p>
     <w:p>
@@ -1084,31 +1079,30 @@
         <w:rPr>
           <w:rFonts w:ascii="標楷體" w:eastAsia="標楷體" w:hAnsi="標楷體"/>
         </w:rPr>
-        <w:t>目前系統已具備核心診斷與紀錄流程，後續可補齊相機拍照、忘記密碼前端、日誌編輯刪除、管理者權限、</w:t>
-      </w:r>
-      <w:r>
-        <w:rPr>
-          <w:rFonts w:eastAsia="標楷體"/>
-        </w:rPr>
-        <w:t>AI</w:t>
-      </w:r>
-      <w:r>
-        <w:rPr>
-          <w:rFonts w:ascii="標楷體" w:eastAsia="標楷體" w:hAnsi="標楷體"/>
-        </w:rPr>
-        <w:t>輸出驗證、正式</w:t>
-      </w:r>
-      <w:r>
-        <w:rPr>
-          <w:rFonts w:eastAsia="標楷體"/>
-        </w:rPr>
-        <w:t>HTTPS</w:t>
-      </w:r>
-      <w:r>
-        <w:rPr>
-          <w:rFonts w:ascii="標楷體" w:eastAsia="標楷體" w:hAnsi="標楷體"/>
-        </w:rPr>
-        <w:t>部署與完整實機測試，使作品更接近可上線的植物健康輔助平台。</w:t>
+        <w:t>本次已實作管理員 Cookie 登入與角色保護、JWT 本人預測暫存及 15 分鐘期限、共用影像品質檢查、來源與複核快照保存、Android 診斷資訊呈現，以及依工作階段與區域區分的監控與後端觸發通知。R</w:t>
+      </w:r>
+      <w:r>
+        <w:rPr>
+          <w:rFonts w:eastAsia="標楷體"/>
+        </w:rPr>
+        <w:t>AG 只以來源完整的 data.json 資料建庫並</w:t>
+      </w:r>
+      <w:r>
+        <w:rPr>
+          <w:rFonts w:ascii="標楷體" w:eastAsia="標楷體" w:hAnsi="標楷體"/>
+        </w:rPr>
+        <w:t>驗證索引清單，不以 DOCX 作為語料。Android 建置因缺少 SDK 受阻，實機與整合驗證尚未完成；正式</w:t>
+      </w:r>
+      <w:r>
+        <w:rPr>
+          <w:rFonts w:eastAsia="標楷體"/>
+        </w:rPr>
+      </w:r>
+      <w:r>
+        <w:rPr>
+          <w:rFonts w:ascii="標楷體" w:eastAsia="標楷體" w:hAnsi="標楷體"/>
+        </w:rPr>
+        <w:t>部署、農業內容品質與辨識成效仍須另行評估。</w:t>
       </w:r>
     </w:p>
     <w:p>

</xml_diff>